<commit_message>
Initialize R project structure for week 8 with configuration settings.
</commit_message>
<xml_diff>
--- a/week8/Vance_week7.docx
+++ b/week8/Vance_week7.docx
@@ -9,120 +9,82 @@
         <w:jc w:val="center"/>
       </w:pPr>
       <w:r>
-        <w:t>Compare dependent versus independent variables. How do these terms relate to supervised learning machine learning models?</w:t>
+        <w:t>In your own words, describe what t-testing is.</w:t>
       </w:r>
     </w:p>
     <w:p>
       <w:pPr>
-        <w:spacing w:line="480" w:lineRule="auto"/>
+        <w:spacing w:after="0" w:line="480" w:lineRule="auto"/>
         <w:ind w:firstLine="720"/>
-      </w:pPr>
-      <w:r>
-        <w:t xml:space="preserve">Variables can best be thought of as dependent or </w:t>
-      </w:r>
-      <w:r>
-        <w:t>independent based</w:t>
-      </w:r>
-      <w:r>
-        <w:t xml:space="preserve"> on how they are framed inside a machine learning model. Independent variables are features which can stand alone and won't depend on the features. These are rarely "acted" on or influenced. By comparison, dependent variables </w:t>
-      </w:r>
-      <w:r>
-        <w:t>occur</w:t>
-      </w:r>
-      <w:r>
-        <w:t xml:space="preserve"> </w:t>
-      </w:r>
-      <w:r>
-        <w:t>because of</w:t>
-      </w:r>
-      <w:r>
-        <w:t xml:space="preserve"> the independent variables. </w:t>
+        <w:outlineLvl w:val="0"/>
+      </w:pPr>
+      <w:r>
+        <w:t>T-Testing is the comparison between the means of two groups after hypothesis testing. The testing is broken into 3 categories. One-sample t-Test, Two-sample t-Test, and Paired t-Test.</w:t>
+      </w:r>
+      <w:r>
+        <w:t xml:space="preserve"> [1]</w:t>
       </w:r>
     </w:p>
     <w:p>
       <w:pPr>
-        <w:spacing w:line="480" w:lineRule="auto"/>
+        <w:spacing w:after="0" w:line="480" w:lineRule="auto"/>
         <w:ind w:firstLine="720"/>
-      </w:pPr>
-      <w:r>
-        <w:t>In traditional machine learning, the dependent variable is the target we try to predict</w:t>
-      </w:r>
-      <w:r>
-        <w:t xml:space="preserve"> [1]</w:t>
-      </w:r>
-      <w:r>
-        <w:t xml:space="preserve">, such as home prices. Home prices are dependent on </w:t>
-      </w:r>
-      <w:r>
-        <w:t>several</w:t>
-      </w:r>
-      <w:r>
-        <w:t xml:space="preserve"> factors, such as the number of bathrooms, bedrooms, zip-code, year built, and so on. The house price reflects the value of the property, and value is dependent on the factors or metadata of a home. </w:t>
+        <w:outlineLvl w:val="0"/>
+      </w:pPr>
+      <w:r>
+        <w:t>One-sample t-Test is a hypothesis used to determine whether a mean different from a value. Suppose we knew a scoop of protein powder contained 10 grams of protein. If we opened a random case of protein powder and measured out 1 scoop, we would expect the scoop contains about 10g of protein. We could repeat this test with 10 other cases of protein and verify that they always contain 10g of protein.</w:t>
       </w:r>
     </w:p>
     <w:p>
       <w:pPr>
-        <w:spacing w:line="480" w:lineRule="auto"/>
+        <w:spacing w:after="0" w:line="480" w:lineRule="auto"/>
         <w:ind w:firstLine="720"/>
-      </w:pPr>
-      <w:r>
-        <w:t xml:space="preserve">If we trained a model on </w:t>
-      </w:r>
-      <w:r>
-        <w:t>predicting</w:t>
-      </w:r>
-      <w:r>
-        <w:t xml:space="preserve"> home prices, we would give the machine some tabular data and try to understand what features influence the </w:t>
-      </w:r>
-      <w:r>
-        <w:t>home</w:t>
-      </w:r>
-      <w:r>
-        <w:t xml:space="preserve"> prices. Of course, not all independent variables share equal influence of dependent variables. For example, suppose each home, regardless of the other columns, had a value over $3,000,000 when inside zip code 90210 (Beverly Hills). We might see homes with 3 bathrooms or 30 bathrooms. Correlation scores would likely give the zip code a much higher value over bathrooms when determining the dependency of features for price value. </w:t>
-      </w:r>
-      <w:r>
-        <w:t>However,</w:t>
-      </w:r>
-      <w:r>
-        <w:t xml:space="preserve"> if we were to examine zip code 68123 where the location is relatively the same</w:t>
-      </w:r>
-      <w:r>
-        <w:t xml:space="preserve"> [2]</w:t>
-      </w:r>
-      <w:r>
-        <w:t xml:space="preserve"> as the surrounding efforts, we would </w:t>
-      </w:r>
-      <w:r>
-        <w:t>likely</w:t>
-      </w:r>
-      <w:r>
-        <w:t xml:space="preserve"> find square foot, number of bedrooms, and year built to be more relevant for determining the independent variable. Numerically, all independent </w:t>
-      </w:r>
-      <w:r>
-        <w:lastRenderedPageBreak/>
-        <w:t>variables could influence the dependent variable, but it's reasonable to hypothesize that only a handful of independent variables truly influence the dependent variable, so importance testing is a must.</w:t>
+        <w:outlineLvl w:val="0"/>
+      </w:pPr>
+      <w:r>
+        <w:t xml:space="preserve">Two-sample t-Test compares two separate groups to see their comparisons. Imagine we have group A with 50 people and group B with 50 people. Both groups are given the same meals and do the same exercise regimen, but group B is given 3 servings of protein powder every day. After 1 month, we would measure the mean </w:t>
+      </w:r>
+      <w:r>
+        <w:t>muscle</w:t>
+      </w:r>
+      <w:r>
+        <w:t xml:space="preserve"> mass of group A and group B. If the protein powder is effective, we would expect group B to have more muscle mass than group A. This type of </w:t>
+      </w:r>
+      <w:r>
+        <w:t>experimentation</w:t>
+      </w:r>
+      <w:r>
+        <w:t xml:space="preserve"> is commonly known as the placebo group. </w:t>
+      </w:r>
+      <w:r>
+        <w:t>[2]</w:t>
       </w:r>
     </w:p>
     <w:p>
       <w:pPr>
-        <w:spacing w:line="480" w:lineRule="auto"/>
+        <w:spacing w:after="0" w:line="480" w:lineRule="auto"/>
         <w:ind w:firstLine="720"/>
-      </w:pPr>
-      <w:r>
-        <w:t xml:space="preserve">In summation, independent variables are raw forms of standalone data. Dependent variables are influenced by the independent variables. In a machine learning context, we should use EDA to test which </w:t>
-      </w:r>
-      <w:r>
-        <w:t>independent</w:t>
-      </w:r>
-      <w:r>
-        <w:t xml:space="preserve"> features are most relevant to the dependent </w:t>
-      </w:r>
-      <w:r>
-        <w:t>variables</w:t>
-      </w:r>
-      <w:r>
-        <w:t>.</w:t>
-      </w:r>
+        <w:outlineLvl w:val="0"/>
+      </w:pPr>
+      <w:r>
+        <w:t xml:space="preserve">Paired tests are when we evaluate a group means before and after a hypothesis. Company "Z" asserts that muscle mass increases 5% in 1 month if customers consume at least 3 scoops of protein powder per day. To test the hypothesis, we gather 100 adults, measure their initial muscle mass, allow them to consume 3 scoops of protein powder every day for a month, and measure their final muscle mass. The difference between the </w:t>
+      </w:r>
+      <w:r>
+        <w:lastRenderedPageBreak/>
+        <w:t xml:space="preserve">mean of the group after 1-month vs 1-month before will confirm </w:t>
+      </w:r>
+      <w:r>
+        <w:t>whether</w:t>
+      </w:r>
+      <w:r>
+        <w:t xml:space="preserve"> the hypothesis was true.</w:t>
+      </w:r>
+    </w:p>
+    <w:p>
+      <w:pPr>
+        <w:spacing w:after="0" w:line="480" w:lineRule="auto"/>
+        <w:outlineLvl w:val="0"/>
+      </w:pPr>
     </w:p>
     <w:p>
       <w:pPr>
@@ -153,7 +115,7 @@
         <w:pStyle w:val="ListParagraph"/>
         <w:numPr>
           <w:ilvl w:val="0"/>
-          <w:numId w:val="3"/>
+          <w:numId w:val="4"/>
         </w:numPr>
         <w:spacing w:after="0" w:line="480" w:lineRule="auto"/>
         <w:rPr>
@@ -168,7 +130,7 @@
           <w:kern w:val="0"/>
           <w14:ligatures w14:val="none"/>
         </w:rPr>
-        <w:t xml:space="preserve">Bhandari, Pritha. “Independent and Dependent Variables.” </w:t>
+        <w:t xml:space="preserve">Bevans, Rebecca. “An Introduction to T Tests | Definitions, Formula and Examples.” </w:t>
       </w:r>
       <w:proofErr w:type="spellStart"/>
       <w:r>
@@ -188,7 +150,7 @@
           <w:kern w:val="0"/>
           <w14:ligatures w14:val="none"/>
         </w:rPr>
-        <w:t>, 3 Feb. 2022, www.scribbr.com/methodology/independent-and-dependent-variables/.</w:t>
+        <w:t>, 2020, www.scribbr.com/statistics/t-test/.</w:t>
       </w:r>
     </w:p>
     <w:p>
@@ -196,7 +158,7 @@
         <w:pStyle w:val="ListParagraph"/>
         <w:numPr>
           <w:ilvl w:val="0"/>
-          <w:numId w:val="3"/>
+          <w:numId w:val="4"/>
         </w:numPr>
         <w:spacing w:after="0" w:line="480" w:lineRule="auto"/>
         <w:rPr>
@@ -211,7 +173,7 @@
           <w:kern w:val="0"/>
           <w14:ligatures w14:val="none"/>
         </w:rPr>
-        <w:t xml:space="preserve">Kids, NCES. “What Are Independent and Dependent Variables.” </w:t>
+        <w:t xml:space="preserve">JMP Statistical Discovery. “The T-Test.” </w:t>
       </w:r>
       <w:r>
         <w:rPr>
@@ -221,7 +183,7 @@
           <w:kern w:val="0"/>
           <w14:ligatures w14:val="none"/>
         </w:rPr>
-        <w:t>Nces.ed.gov</w:t>
+        <w:t>Jmp.com</w:t>
       </w:r>
       <w:r>
         <w:rPr>
@@ -229,43 +191,7 @@
           <w:kern w:val="0"/>
           <w14:ligatures w14:val="none"/>
         </w:rPr>
-        <w:t>, 2019, nces.ed.gov/</w:t>
-      </w:r>
-      <w:proofErr w:type="spellStart"/>
-      <w:r>
-        <w:rPr>
-          <w:rFonts w:ascii="Times New Roman" w:eastAsia="Times New Roman" w:hAnsi="Times New Roman" w:cs="Times New Roman"/>
-          <w:kern w:val="0"/>
-          <w14:ligatures w14:val="none"/>
-        </w:rPr>
-        <w:t>nceskids</w:t>
-      </w:r>
-      <w:proofErr w:type="spellEnd"/>
-      <w:r>
-        <w:rPr>
-          <w:rFonts w:ascii="Times New Roman" w:eastAsia="Times New Roman" w:hAnsi="Times New Roman" w:cs="Times New Roman"/>
-          <w:kern w:val="0"/>
-          <w14:ligatures w14:val="none"/>
-        </w:rPr>
-        <w:t>/help/</w:t>
-      </w:r>
-      <w:proofErr w:type="spellStart"/>
-      <w:r>
-        <w:rPr>
-          <w:rFonts w:ascii="Times New Roman" w:eastAsia="Times New Roman" w:hAnsi="Times New Roman" w:cs="Times New Roman"/>
-          <w:kern w:val="0"/>
-          <w14:ligatures w14:val="none"/>
-        </w:rPr>
-        <w:t>user_guide</w:t>
-      </w:r>
-      <w:proofErr w:type="spellEnd"/>
-      <w:r>
-        <w:rPr>
-          <w:rFonts w:ascii="Times New Roman" w:eastAsia="Times New Roman" w:hAnsi="Times New Roman" w:cs="Times New Roman"/>
-          <w:kern w:val="0"/>
-          <w14:ligatures w14:val="none"/>
-        </w:rPr>
-        <w:t>/graph/variables.asp.</w:t>
+        <w:t>, 2025, www.jmp.com/en/statistics-knowledge-portal/t-test.</w:t>
       </w:r>
     </w:p>
     <w:p>
@@ -369,7 +295,7 @@
       <w:t xml:space="preserve">April </w:t>
     </w:r>
     <w:r>
-      <w:t>23</w:t>
+      <w:t>30</w:t>
     </w:r>
     <w:r>
       <w:t>, 2025</w:t>
@@ -652,6 +578,95 @@
       </w:pPr>
     </w:lvl>
   </w:abstractNum>
+  <w:abstractNum w:abstractNumId="3" w15:restartNumberingAfterBreak="0">
+    <w:nsid w:val="582961E0"/>
+    <w:multiLevelType w:val="hybridMultilevel"/>
+    <w:tmpl w:val="6032CAB6"/>
+    <w:lvl w:ilvl="0" w:tplc="93C459E6">
+      <w:start w:val="1"/>
+      <w:numFmt w:val="decimal"/>
+      <w:lvlText w:val="%1."/>
+      <w:lvlJc w:val="left"/>
+      <w:pPr>
+        <w:ind w:left="-360" w:hanging="360"/>
+      </w:pPr>
+      <w:rPr>
+        <w:rFonts w:hint="default"/>
+      </w:rPr>
+    </w:lvl>
+    <w:lvl w:ilvl="1" w:tplc="04090019" w:tentative="1">
+      <w:start w:val="1"/>
+      <w:numFmt w:val="lowerLetter"/>
+      <w:lvlText w:val="%2."/>
+      <w:lvlJc w:val="left"/>
+      <w:pPr>
+        <w:ind w:left="360" w:hanging="360"/>
+      </w:pPr>
+    </w:lvl>
+    <w:lvl w:ilvl="2" w:tplc="0409001B" w:tentative="1">
+      <w:start w:val="1"/>
+      <w:numFmt w:val="lowerRoman"/>
+      <w:lvlText w:val="%3."/>
+      <w:lvlJc w:val="right"/>
+      <w:pPr>
+        <w:ind w:left="1080" w:hanging="180"/>
+      </w:pPr>
+    </w:lvl>
+    <w:lvl w:ilvl="3" w:tplc="0409000F" w:tentative="1">
+      <w:start w:val="1"/>
+      <w:numFmt w:val="decimal"/>
+      <w:lvlText w:val="%4."/>
+      <w:lvlJc w:val="left"/>
+      <w:pPr>
+        <w:ind w:left="1800" w:hanging="360"/>
+      </w:pPr>
+    </w:lvl>
+    <w:lvl w:ilvl="4" w:tplc="04090019" w:tentative="1">
+      <w:start w:val="1"/>
+      <w:numFmt w:val="lowerLetter"/>
+      <w:lvlText w:val="%5."/>
+      <w:lvlJc w:val="left"/>
+      <w:pPr>
+        <w:ind w:left="2520" w:hanging="360"/>
+      </w:pPr>
+    </w:lvl>
+    <w:lvl w:ilvl="5" w:tplc="0409001B" w:tentative="1">
+      <w:start w:val="1"/>
+      <w:numFmt w:val="lowerRoman"/>
+      <w:lvlText w:val="%6."/>
+      <w:lvlJc w:val="right"/>
+      <w:pPr>
+        <w:ind w:left="3240" w:hanging="180"/>
+      </w:pPr>
+    </w:lvl>
+    <w:lvl w:ilvl="6" w:tplc="0409000F" w:tentative="1">
+      <w:start w:val="1"/>
+      <w:numFmt w:val="decimal"/>
+      <w:lvlText w:val="%7."/>
+      <w:lvlJc w:val="left"/>
+      <w:pPr>
+        <w:ind w:left="3960" w:hanging="360"/>
+      </w:pPr>
+    </w:lvl>
+    <w:lvl w:ilvl="7" w:tplc="04090019" w:tentative="1">
+      <w:start w:val="1"/>
+      <w:numFmt w:val="lowerLetter"/>
+      <w:lvlText w:val="%8."/>
+      <w:lvlJc w:val="left"/>
+      <w:pPr>
+        <w:ind w:left="4680" w:hanging="360"/>
+      </w:pPr>
+    </w:lvl>
+    <w:lvl w:ilvl="8" w:tplc="0409001B" w:tentative="1">
+      <w:start w:val="1"/>
+      <w:numFmt w:val="lowerRoman"/>
+      <w:lvlText w:val="%9."/>
+      <w:lvlJc w:val="right"/>
+      <w:pPr>
+        <w:ind w:left="5400" w:hanging="180"/>
+      </w:pPr>
+    </w:lvl>
+  </w:abstractNum>
   <w:num w:numId="1" w16cid:durableId="1648127466">
     <w:abstractNumId w:val="0"/>
   </w:num>
@@ -660,6 +675,9 @@
   </w:num>
   <w:num w:numId="3" w16cid:durableId="1197505074">
     <w:abstractNumId w:val="2"/>
+  </w:num>
+  <w:num w:numId="4" w16cid:durableId="1450509330">
+    <w:abstractNumId w:val="3"/>
   </w:num>
 </w:numbering>
 </file>

</xml_diff>